<commit_message>
Rebuild FTA de-registration file on the audited figures
The official documents show the tax period is 13/02/2024-31/01/2025, not the
calendar years previously assumed, and the licence cancellation letter the FTA
asks for was already issued by DIEZ on 28/02/2025. The earlier nil statements
also contradicted the audited report on two points (bank accounts, expenses),
which would have sunk the submission.

Replace the nil financials with a trial balance - the only item the FTA asked
for that the audit report does not contain - restate the declaration letter to
agree with the audited figures, and drop the DIEZ request emails that are no
longer needed. Add the CT return exposure, which blocks de-registration
independently of the information request.

Co-Authored-By: Claude Opus 5 <noreply@anthropic.com>
Claude-Session: https://claude.ai/code/session_01CsrzWGQhvnpbdB45RFamLp
</commit_message>
<xml_diff>
--- a/uae-ct-closure/out/01_Declaration_Letter_FTA_101001430723.docx
+++ b/uae-ct-closure/out/01_Declaration_Letter_FTA_101001430723.docx
@@ -4,7 +4,7 @@
   <w:body>
     <w:p>
       <w:pPr>
-        <w:spacing w:after="20" w:before="0" w:line="228" w:lineRule="auto"/>
+        <w:spacing w:after="20" w:before="0" w:line="240" w:lineRule="auto"/>
         <w:jc w:val="center"/>
       </w:pPr>
       <w:r>
@@ -14,12 +14,12 @@
           <w:i w:val="0"/>
           <w:sz w:val="26"/>
         </w:rPr>
-        <w:t>ELIES ECOMMERCE &amp; DIGITAL FZCO</w:t>
+        <w:t>ELIES ECOMMERCE &amp; DIGITAL - FZCO</w:t>
       </w:r>
     </w:p>
     <w:p>
       <w:pPr>
-        <w:spacing w:after="20" w:before="0" w:line="228" w:lineRule="auto"/>
+        <w:spacing w:after="20" w:before="0" w:line="240" w:lineRule="auto"/>
         <w:jc w:val="center"/>
       </w:pPr>
       <w:r>
@@ -29,12 +29,12 @@
           <w:i w:val="0"/>
           <w:sz w:val="17"/>
         </w:rPr>
-        <w:t>Free Zone Company (FZCO)  |  IFZA Properties, Dubai Silicon Oasis, Dubai, United Arab Emirates</w:t>
+        <w:t>Premises No. DSO-IFZA, IFZA Properties, Dubai Silicon Oasis, Dubai, United Arab Emirates</w:t>
       </w:r>
     </w:p>
     <w:p>
       <w:pPr>
-        <w:spacing w:after="120" w:before="0" w:line="228" w:lineRule="auto"/>
+        <w:spacing w:after="160" w:before="0" w:line="240" w:lineRule="auto"/>
         <w:jc w:val="center"/>
       </w:pPr>
       <w:r>
@@ -44,93 +44,255 @@
           <w:i w:val="0"/>
           <w:sz w:val="17"/>
         </w:rPr>
-        <w:t>Trade Licence No. 41532 (DIEZ - Dubai Silicon Oasis)  |  Corporate Tax Ref. No. 101001430723</w:t>
+        <w:t>Registration No. DSO-FZCO-39398  |  Trade Licence No. 41532  |  Corporate Tax Registration No. 101001430723</w:t>
       </w:r>
     </w:p>
     <w:p>
       <w:pPr>
-        <w:spacing w:after="60" w:before="0" w:line="228" w:lineRule="auto"/>
+        <w:spacing w:after="120" w:before="0" w:line="240" w:lineRule="auto"/>
       </w:pPr>
       <w:r>
         <w:rPr>
           <w:rFonts w:ascii="Calibri" w:hAnsi="Calibri"/>
           <w:b w:val="0"/>
           <w:i w:val="0"/>
-          <w:sz w:val="18"/>
+          <w:sz w:val="19"/>
         </w:rPr>
-        <w:t>Date: &lt;&lt;DD&gt;&gt; September 2026</w:t>
+        <w:t>18 September 2026</w:t>
       </w:r>
     </w:p>
     <w:p>
       <w:pPr>
-        <w:spacing w:after="80" w:before="0" w:line="228" w:lineRule="auto"/>
+        <w:spacing w:after="0" w:before="0" w:line="240" w:lineRule="auto"/>
       </w:pPr>
       <w:r>
         <w:rPr>
           <w:rFonts w:ascii="Calibri" w:hAnsi="Calibri"/>
           <w:b/>
           <w:i w:val="0"/>
-          <w:sz w:val="18"/>
+          <w:sz w:val="19"/>
         </w:rPr>
-        <w:t>To: The Federal Tax Authority - Corporate Tax Department, United Arab Emirates</w:t>
+        <w:t>Federal Tax Authority</w:t>
       </w:r>
     </w:p>
     <w:p>
       <w:pPr>
-        <w:spacing w:after="60" w:before="0" w:line="228" w:lineRule="auto"/>
+        <w:spacing w:after="160" w:before="0" w:line="240" w:lineRule="auto"/>
+      </w:pPr>
+      <w:r>
+        <w:rPr>
+          <w:rFonts w:ascii="Calibri" w:hAnsi="Calibri"/>
+          <w:b w:val="0"/>
+          <w:i w:val="0"/>
+          <w:sz w:val="19"/>
+        </w:rPr>
+        <w:t>United Arab Emirates</w:t>
+      </w:r>
+    </w:p>
+    <w:p>
+      <w:pPr>
+        <w:spacing w:after="160" w:before="0" w:line="240" w:lineRule="auto"/>
       </w:pPr>
       <w:r>
         <w:rPr>
           <w:rFonts w:ascii="Calibri" w:hAnsi="Calibri"/>
           <w:b/>
           <w:i w:val="0"/>
-          <w:sz w:val="18"/>
+          <w:sz w:val="19"/>
         </w:rPr>
-        <w:t>SUBJECT: DECLARATION OF REVENUES AND ASSETS IN SUPPORT OF CORPORATE TAX DE-REGISTRATION APPLICATION</w:t>
+        <w:t>Subject: Declaration of Revenue and Assets for all Tax Periods - Corporate Tax De-Registration (TRN 101001430723)</w:t>
+      </w:r>
+    </w:p>
+    <w:p>
+      <w:pPr>
+        <w:spacing w:after="120" w:before="0" w:line="240" w:lineRule="auto"/>
+      </w:pPr>
+      <w:r>
+        <w:rPr>
+          <w:rFonts w:ascii="Calibri" w:hAnsi="Calibri"/>
+          <w:b w:val="0"/>
+          <w:i w:val="0"/>
+          <w:sz w:val="19"/>
+        </w:rPr>
+        <w:t>Dear Sir / Madam,</w:t>
+      </w:r>
+    </w:p>
+    <w:p>
+      <w:pPr>
+        <w:spacing w:after="160" w:before="0" w:line="240" w:lineRule="auto"/>
+        <w:jc w:val="both"/>
+      </w:pPr>
+      <w:r>
+        <w:rPr>
+          <w:rFonts w:ascii="Calibri" w:hAnsi="Calibri"/>
+          <w:b w:val="0"/>
+          <w:i w:val="0"/>
+          <w:sz w:val="19"/>
+        </w:rPr>
+        <w:t>We refer to your requests for additional information dated 30 April 2025, 13 February 2026 and 9 September 2026 in connection with the above de-registration application. We hereby declare the following, which is supported by the audited financial statements and the official documents enclosed with this letter.</w:t>
+      </w:r>
+    </w:p>
+    <w:p>
+      <w:pPr>
+        <w:spacing w:after="60" w:before="0" w:line="240" w:lineRule="auto"/>
+      </w:pPr>
+      <w:r>
+        <w:rPr>
+          <w:rFonts w:ascii="Calibri" w:hAnsi="Calibri"/>
+          <w:b/>
+          <w:i w:val="0"/>
+          <w:sz w:val="19"/>
+        </w:rPr>
+        <w:t>1.  The Company</w:t>
+      </w:r>
+    </w:p>
+    <w:p>
+      <w:pPr>
+        <w:spacing w:after="160" w:before="0" w:line="240" w:lineRule="auto"/>
+        <w:jc w:val="both"/>
+      </w:pPr>
+      <w:r>
+        <w:rPr>
+          <w:rFonts w:ascii="Calibri" w:hAnsi="Calibri"/>
+          <w:b w:val="0"/>
+          <w:i w:val="0"/>
+          <w:sz w:val="19"/>
+        </w:rPr>
+        <w:t>ELIES ECOMMERCE &amp; DIGITAL - FZCO was registered in Dubai Silicon Oasis on 13 February 2024 under Registration No. DSO-FZCO-39398, Trade Licence No. 41532, as a Free Zone Company with limited liability. Its licensed activity was Ecommerce. The Company is wholly owned and was managed by Elies Bechahed, a French national. The Company is not registered for value added tax.</w:t>
+      </w:r>
+    </w:p>
+    <w:p>
+      <w:pPr>
+        <w:spacing w:after="60" w:before="0" w:line="240" w:lineRule="auto"/>
+      </w:pPr>
+      <w:r>
+        <w:rPr>
+          <w:rFonts w:ascii="Calibri" w:hAnsi="Calibri"/>
+          <w:b/>
+          <w:i w:val="0"/>
+          <w:sz w:val="19"/>
+        </w:rPr>
+        <w:t>2.  Tax Periods Concerned</w:t>
+      </w:r>
+    </w:p>
+    <w:p>
+      <w:pPr>
+        <w:spacing w:after="120" w:before="0" w:line="240" w:lineRule="auto"/>
+        <w:jc w:val="both"/>
+      </w:pPr>
+      <w:r>
+        <w:rPr>
+          <w:rFonts w:ascii="Calibri" w:hAnsi="Calibri"/>
+          <w:b w:val="0"/>
+          <w:i w:val="0"/>
+          <w:sz w:val="19"/>
+        </w:rPr>
+        <w:t>The Company had a single Tax Period, running from 13 February 2024 (date of registration) to 31 January 2025 (effective date of liquidation). The Company was placed into liquidation by a resolution of the shareholder passed on 30 January 2025. Its trade licence was subsequently cancelled by Dubai Integrated Economic Zones Authority (DIEZ) - Dubai Silicon Oasis on 28 February 2025. No Tax Period exists after that date.</w:t>
+      </w:r>
+    </w:p>
+    <w:p>
+      <w:pPr>
+        <w:spacing w:after="60" w:before="0" w:line="240" w:lineRule="auto"/>
+      </w:pPr>
+      <w:r>
+        <w:rPr>
+          <w:rFonts w:ascii="Calibri" w:hAnsi="Calibri"/>
+          <w:b/>
+          <w:i w:val="0"/>
+          <w:sz w:val="19"/>
+        </w:rPr>
+        <w:t>3.  Declaration of Revenue and Assets</w:t>
       </w:r>
     </w:p>
     <w:tbl>
       <w:tblPr>
+        <w:tblStyle w:val="TableGrid"/>
         <w:tblW w:type="auto" w:w="0"/>
-        <w:jc w:val="left"/>
         <w:tblLook w:firstColumn="1" w:firstRow="1" w:lastColumn="0" w:lastRow="0" w:noHBand="0" w:noVBand="1" w:val="04A0"/>
       </w:tblPr>
       <w:tblGrid>
-        <w:gridCol w:w="5043"/>
-        <w:gridCol w:w="5043"/>
+        <w:gridCol w:w="2493"/>
+        <w:gridCol w:w="2493"/>
+        <w:gridCol w:w="2493"/>
+        <w:gridCol w:w="2493"/>
       </w:tblGrid>
       <w:tr>
         <w:tc>
           <w:tcPr>
-            <w:tcW w:type="dxa" w:w="2948"/>
+            <w:tcW w:type="dxa" w:w="2493"/>
           </w:tcPr>
           <w:p>
             <w:pPr>
-              <w:spacing w:after="0"/>
+              <w:spacing w:after="20" w:before="20"/>
             </w:pPr>
+            <w:r/>
             <w:r>
               <w:rPr>
+                <w:rFonts w:ascii="Calibri" w:hAnsi="Calibri"/>
                 <w:b/>
                 <w:sz w:val="17"/>
               </w:rPr>
-              <w:t>Taxable Person</w:t>
+              <w:t>Tax Period</w:t>
             </w:r>
           </w:p>
         </w:tc>
         <w:tc>
           <w:tcPr>
-            <w:tcW w:type="dxa" w:w="6746"/>
+            <w:tcW w:type="dxa" w:w="2493"/>
           </w:tcPr>
           <w:p>
             <w:pPr>
-              <w:spacing w:after="0"/>
+              <w:spacing w:after="20" w:before="20"/>
+              <w:jc w:val="center"/>
             </w:pPr>
+            <w:r/>
             <w:r>
               <w:rPr>
-                <w:b w:val="0"/>
+                <w:rFonts w:ascii="Calibri" w:hAnsi="Calibri"/>
+                <w:b/>
                 <w:sz w:val="17"/>
               </w:rPr>
-              <w:t>ELIES ECOMMERCE &amp; DIGITAL FZCO</w:t>
+              <w:t>Revenue (AED)</w:t>
+            </w:r>
+          </w:p>
+        </w:tc>
+        <w:tc>
+          <w:tcPr>
+            <w:tcW w:type="dxa" w:w="2493"/>
+          </w:tcPr>
+          <w:p>
+            <w:pPr>
+              <w:spacing w:after="20" w:before="20"/>
+              <w:jc w:val="center"/>
+            </w:pPr>
+            <w:r/>
+            <w:r>
+              <w:rPr>
+                <w:rFonts w:ascii="Calibri" w:hAnsi="Calibri"/>
+                <w:b/>
+                <w:sz w:val="17"/>
+              </w:rPr>
+              <w:t>Total Assets (AED)</w:t>
+            </w:r>
+          </w:p>
+        </w:tc>
+        <w:tc>
+          <w:tcPr>
+            <w:tcW w:type="dxa" w:w="2493"/>
+          </w:tcPr>
+          <w:p>
+            <w:pPr>
+              <w:spacing w:after="20" w:before="20"/>
+              <w:jc w:val="center"/>
+            </w:pPr>
+            <w:r/>
+            <w:r>
+              <w:rPr>
+                <w:rFonts w:ascii="Calibri" w:hAnsi="Calibri"/>
+                <w:b/>
+                <w:sz w:val="17"/>
+              </w:rPr>
+              <w:t>Total Liabilities (AED)</w:t>
             </w:r>
           </w:p>
         </w:tc>
@@ -138,393 +300,38 @@
       <w:tr>
         <w:tc>
           <w:tcPr>
-            <w:tcW w:type="dxa" w:w="2948"/>
+            <w:tcW w:type="dxa" w:w="2493"/>
           </w:tcPr>
           <w:p>
             <w:pPr>
-              <w:spacing w:after="0"/>
+              <w:spacing w:after="20" w:before="20"/>
             </w:pPr>
+            <w:r/>
             <w:r>
               <w:rPr>
-                <w:b/>
+                <w:rFonts w:ascii="Calibri" w:hAnsi="Calibri"/>
+                <w:b w:val="0"/>
                 <w:sz w:val="17"/>
               </w:rPr>
-              <w:t>Corporate Tax Reference No.</w:t>
+              <w:t>13 February 2024 to 31 January 2025</w:t>
             </w:r>
           </w:p>
         </w:tc>
         <w:tc>
           <w:tcPr>
-            <w:tcW w:type="dxa" w:w="6746"/>
+            <w:tcW w:type="dxa" w:w="2493"/>
           </w:tcPr>
           <w:p>
             <w:pPr>
-              <w:spacing w:after="0"/>
+              <w:spacing w:after="20" w:before="20"/>
+              <w:jc w:val="center"/>
             </w:pPr>
+            <w:r/>
             <w:r>
               <w:rPr>
+                <w:rFonts w:ascii="Calibri" w:hAnsi="Calibri"/>
                 <w:b w:val="0"/>
                 <w:sz w:val="17"/>
-              </w:rPr>
-              <w:t>101001430723</w:t>
-            </w:r>
-          </w:p>
-        </w:tc>
-      </w:tr>
-      <w:tr>
-        <w:tc>
-          <w:tcPr>
-            <w:tcW w:type="dxa" w:w="2948"/>
-          </w:tcPr>
-          <w:p>
-            <w:pPr>
-              <w:spacing w:after="0"/>
-            </w:pPr>
-            <w:r>
-              <w:rPr>
-                <w:b/>
-                <w:sz w:val="17"/>
-              </w:rPr>
-              <w:t>Trade Licence No.</w:t>
-            </w:r>
-          </w:p>
-        </w:tc>
-        <w:tc>
-          <w:tcPr>
-            <w:tcW w:type="dxa" w:w="6746"/>
-          </w:tcPr>
-          <w:p>
-            <w:pPr>
-              <w:spacing w:after="0"/>
-            </w:pPr>
-            <w:r>
-              <w:rPr>
-                <w:b w:val="0"/>
-                <w:sz w:val="17"/>
-              </w:rPr>
-              <w:t>41532, issued by DIEZ - Dubai Silicon Oasis</w:t>
-            </w:r>
-          </w:p>
-        </w:tc>
-      </w:tr>
-      <w:tr>
-        <w:tc>
-          <w:tcPr>
-            <w:tcW w:type="dxa" w:w="2948"/>
-          </w:tcPr>
-          <w:p>
-            <w:pPr>
-              <w:spacing w:after="0"/>
-            </w:pPr>
-            <w:r>
-              <w:rPr>
-                <w:b/>
-                <w:sz w:val="17"/>
-              </w:rPr>
-              <w:t>Date of incorporation</w:t>
-            </w:r>
-          </w:p>
-        </w:tc>
-        <w:tc>
-          <w:tcPr>
-            <w:tcW w:type="dxa" w:w="6746"/>
-          </w:tcPr>
-          <w:p>
-            <w:pPr>
-              <w:spacing w:after="0"/>
-            </w:pPr>
-            <w:r>
-              <w:rPr>
-                <w:b w:val="0"/>
-                <w:sz w:val="17"/>
-              </w:rPr>
-              <w:t>&lt;&lt;DD Month YYYY&gt;&gt;</w:t>
-            </w:r>
-          </w:p>
-        </w:tc>
-      </w:tr>
-      <w:tr>
-        <w:tc>
-          <w:tcPr>
-            <w:tcW w:type="dxa" w:w="2948"/>
-          </w:tcPr>
-          <w:p>
-            <w:pPr>
-              <w:spacing w:after="0"/>
-            </w:pPr>
-            <w:r>
-              <w:rPr>
-                <w:b/>
-                <w:sz w:val="17"/>
-              </w:rPr>
-              <w:t>Date of cessation of business</w:t>
-            </w:r>
-          </w:p>
-        </w:tc>
-        <w:tc>
-          <w:tcPr>
-            <w:tcW w:type="dxa" w:w="6746"/>
-          </w:tcPr>
-          <w:p>
-            <w:pPr>
-              <w:spacing w:after="0"/>
-            </w:pPr>
-            <w:r>
-              <w:rPr>
-                <w:b w:val="0"/>
-                <w:sz w:val="17"/>
-              </w:rPr>
-              <w:t>&lt;&lt;DD Month YYYY&gt;&gt;</w:t>
-            </w:r>
-          </w:p>
-        </w:tc>
-      </w:tr>
-    </w:tbl>
-    <w:p>
-      <w:pPr>
-        <w:spacing w:after="40" w:before="0" w:line="228" w:lineRule="auto"/>
-      </w:pPr>
-      <w:r>
-        <w:rPr>
-          <w:rFonts w:ascii="Calibri" w:hAnsi="Calibri"/>
-          <w:b w:val="0"/>
-          <w:i w:val="0"/>
-          <w:sz w:val="20"/>
-        </w:rPr>
-      </w:r>
-    </w:p>
-    <w:p>
-      <w:pPr>
-        <w:spacing w:after="40" w:before="0" w:line="228" w:lineRule="auto"/>
-      </w:pPr>
-      <w:r>
-        <w:rPr>
-          <w:rFonts w:ascii="Calibri" w:hAnsi="Calibri"/>
-          <w:b w:val="0"/>
-          <w:i w:val="0"/>
-          <w:sz w:val="18"/>
-        </w:rPr>
-        <w:t>Dear Sir / Madam,</w:t>
-      </w:r>
-    </w:p>
-    <w:p>
-      <w:pPr>
-        <w:spacing w:after="60" w:before="0" w:line="228" w:lineRule="auto"/>
-      </w:pPr>
-      <w:r>
-        <w:rPr>
-          <w:rFonts w:ascii="Calibri" w:hAnsi="Calibri"/>
-          <w:b w:val="0"/>
-          <w:i w:val="0"/>
-          <w:sz w:val="18"/>
-        </w:rPr>
-        <w:t>Further to the Authority's requests for additional information dated 30 April 2025, 13 February 2026 and 9 September 2026 on the above Corporate Tax de-registration application, and taking up the option to submit a signed and stamped declaration of revenues and assets in lieu of financial statements, the Taxable Person declares as follows.</w:t>
-      </w:r>
-    </w:p>
-    <w:p>
-      <w:pPr>
-        <w:spacing w:after="40" w:before="0" w:line="228" w:lineRule="auto"/>
-      </w:pPr>
-      <w:r>
-        <w:rPr>
-          <w:rFonts w:ascii="Calibri" w:hAnsi="Calibri"/>
-          <w:b/>
-          <w:i w:val="0"/>
-          <w:sz w:val="18"/>
-        </w:rPr>
-        <w:t>1.  DECLARATION PER TAX PERIOD</w:t>
-      </w:r>
-    </w:p>
-    <w:p>
-      <w:pPr>
-        <w:spacing w:after="40" w:before="0" w:line="228" w:lineRule="auto"/>
-      </w:pPr>
-      <w:r>
-        <w:rPr>
-          <w:rFonts w:ascii="Calibri" w:hAnsi="Calibri"/>
-          <w:b w:val="0"/>
-          <w:i w:val="0"/>
-          <w:sz w:val="18"/>
-        </w:rPr>
-        <w:t>For each and every tax period of the Taxable Person, the figures are as follows:</w:t>
-      </w:r>
-    </w:p>
-    <w:tbl>
-      <w:tblPr>
-        <w:tblStyle w:val="TableGrid"/>
-        <w:tblW w:type="auto" w:w="0"/>
-        <w:jc w:val="center"/>
-        <w:tblLayout w:type="fixed"/>
-        <w:tblLook w:firstColumn="1" w:firstRow="1" w:lastColumn="0" w:lastRow="0" w:noHBand="0" w:noVBand="1" w:val="04A0"/>
-      </w:tblPr>
-      <w:tblGrid>
-        <w:gridCol w:w="1681"/>
-        <w:gridCol w:w="1681"/>
-        <w:gridCol w:w="1681"/>
-        <w:gridCol w:w="1681"/>
-        <w:gridCol w:w="1681"/>
-        <w:gridCol w:w="1681"/>
-      </w:tblGrid>
-      <w:tr>
-        <w:tc>
-          <w:tcPr>
-            <w:tcW w:type="dxa" w:w="1077"/>
-          </w:tcPr>
-          <w:p>
-            <w:pPr>
-              <w:spacing w:after="0"/>
-              <w:jc w:val="center"/>
-            </w:pPr>
-            <w:r>
-              <w:rPr>
-                <w:b/>
-                <w:sz w:val="16"/>
-              </w:rPr>
-              <w:t>Tax period</w:t>
-            </w:r>
-          </w:p>
-        </w:tc>
-        <w:tc>
-          <w:tcPr>
-            <w:tcW w:type="dxa" w:w="2154"/>
-          </w:tcPr>
-          <w:p>
-            <w:pPr>
-              <w:spacing w:after="0"/>
-              <w:jc w:val="center"/>
-            </w:pPr>
-            <w:r>
-              <w:rPr>
-                <w:b/>
-                <w:sz w:val="16"/>
-              </w:rPr>
-              <w:t>Period covered</w:t>
-            </w:r>
-          </w:p>
-        </w:tc>
-        <w:tc>
-          <w:tcPr>
-            <w:tcW w:type="dxa" w:w="1361"/>
-          </w:tcPr>
-          <w:p>
-            <w:pPr>
-              <w:spacing w:after="0"/>
-              <w:jc w:val="center"/>
-            </w:pPr>
-            <w:r>
-              <w:rPr>
-                <w:b/>
-                <w:sz w:val="16"/>
-              </w:rPr>
-              <w:t>Revenue (AED)</w:t>
-            </w:r>
-          </w:p>
-        </w:tc>
-        <w:tc>
-          <w:tcPr>
-            <w:tcW w:type="dxa" w:w="1361"/>
-          </w:tcPr>
-          <w:p>
-            <w:pPr>
-              <w:spacing w:after="0"/>
-              <w:jc w:val="center"/>
-            </w:pPr>
-            <w:r>
-              <w:rPr>
-                <w:b/>
-                <w:sz w:val="16"/>
-              </w:rPr>
-              <w:t>Total assets (AED)</w:t>
-            </w:r>
-          </w:p>
-        </w:tc>
-        <w:tc>
-          <w:tcPr>
-            <w:tcW w:type="dxa" w:w="1417"/>
-          </w:tcPr>
-          <w:p>
-            <w:pPr>
-              <w:spacing w:after="0"/>
-              <w:jc w:val="center"/>
-            </w:pPr>
-            <w:r>
-              <w:rPr>
-                <w:b/>
-                <w:sz w:val="16"/>
-              </w:rPr>
-              <w:t>Total liabilities (AED)</w:t>
-            </w:r>
-          </w:p>
-        </w:tc>
-        <w:tc>
-          <w:tcPr>
-            <w:tcW w:type="dxa" w:w="1417"/>
-          </w:tcPr>
-          <w:p>
-            <w:pPr>
-              <w:spacing w:after="0"/>
-              <w:jc w:val="center"/>
-            </w:pPr>
-            <w:r>
-              <w:rPr>
-                <w:b/>
-                <w:sz w:val="16"/>
-              </w:rPr>
-              <w:t>Taxable income (AED)</w:t>
-            </w:r>
-          </w:p>
-        </w:tc>
-      </w:tr>
-      <w:tr>
-        <w:tc>
-          <w:tcPr>
-            <w:tcW w:type="dxa" w:w="1077"/>
-          </w:tcPr>
-          <w:p>
-            <w:pPr>
-              <w:spacing w:after="0"/>
-              <w:jc w:val="center"/>
-            </w:pPr>
-            <w:r>
-              <w:rPr>
-                <w:b w:val="0"/>
-                <w:sz w:val="16"/>
-              </w:rPr>
-              <w:t>FY2024</w:t>
-            </w:r>
-          </w:p>
-        </w:tc>
-        <w:tc>
-          <w:tcPr>
-            <w:tcW w:type="dxa" w:w="2154"/>
-          </w:tcPr>
-          <w:p>
-            <w:pPr>
-              <w:spacing w:after="0"/>
-              <w:jc w:val="center"/>
-            </w:pPr>
-            <w:r>
-              <w:rPr>
-                <w:b w:val="0"/>
-                <w:sz w:val="16"/>
-              </w:rPr>
-              <w:t>1 Jan 2024 - 31 Dec 2024</w:t>
-            </w:r>
-          </w:p>
-        </w:tc>
-        <w:tc>
-          <w:tcPr>
-            <w:tcW w:type="dxa" w:w="1361"/>
-          </w:tcPr>
-          <w:p>
-            <w:pPr>
-              <w:spacing w:after="0"/>
-              <w:jc w:val="center"/>
-            </w:pPr>
-            <w:r>
-              <w:rPr>
-                <w:b/>
-                <w:sz w:val="16"/>
               </w:rPr>
               <w:t>NIL (0.00)</w:t>
             </w:r>
@@ -532,17 +339,19 @@
         </w:tc>
         <w:tc>
           <w:tcPr>
-            <w:tcW w:type="dxa" w:w="1361"/>
+            <w:tcW w:type="dxa" w:w="2493"/>
           </w:tcPr>
           <w:p>
             <w:pPr>
-              <w:spacing w:after="0"/>
+              <w:spacing w:after="20" w:before="20"/>
               <w:jc w:val="center"/>
             </w:pPr>
+            <w:r/>
             <w:r>
               <w:rPr>
-                <w:b/>
-                <w:sz w:val="16"/>
+                <w:rFonts w:ascii="Calibri" w:hAnsi="Calibri"/>
+                <w:b w:val="0"/>
+                <w:sz w:val="17"/>
               </w:rPr>
               <w:t>NIL (0.00)</w:t>
             </w:r>
@@ -550,35 +359,19 @@
         </w:tc>
         <w:tc>
           <w:tcPr>
-            <w:tcW w:type="dxa" w:w="1417"/>
+            <w:tcW w:type="dxa" w:w="2493"/>
           </w:tcPr>
           <w:p>
             <w:pPr>
-              <w:spacing w:after="0"/>
+              <w:spacing w:after="20" w:before="20"/>
               <w:jc w:val="center"/>
             </w:pPr>
+            <w:r/>
             <w:r>
               <w:rPr>
-                <w:b/>
-                <w:sz w:val="16"/>
-              </w:rPr>
-              <w:t>NIL (0.00)</w:t>
-            </w:r>
-          </w:p>
-        </w:tc>
-        <w:tc>
-          <w:tcPr>
-            <w:tcW w:type="dxa" w:w="1417"/>
-          </w:tcPr>
-          <w:p>
-            <w:pPr>
-              <w:spacing w:after="0"/>
-              <w:jc w:val="center"/>
-            </w:pPr>
-            <w:r>
-              <w:rPr>
-                <w:b/>
-                <w:sz w:val="16"/>
+                <w:rFonts w:ascii="Calibri" w:hAnsi="Calibri"/>
+                <w:b w:val="0"/>
+                <w:sz w:val="17"/>
               </w:rPr>
               <w:t>NIL (0.00)</w:t>
             </w:r>
@@ -588,53 +381,38 @@
       <w:tr>
         <w:tc>
           <w:tcPr>
-            <w:tcW w:type="dxa" w:w="1077"/>
+            <w:tcW w:type="dxa" w:w="2493"/>
           </w:tcPr>
           <w:p>
             <w:pPr>
-              <w:spacing w:after="0"/>
-              <w:jc w:val="center"/>
+              <w:spacing w:after="20" w:before="20"/>
             </w:pPr>
+            <w:r/>
             <w:r>
               <w:rPr>
+                <w:rFonts w:ascii="Calibri" w:hAnsi="Calibri"/>
                 <w:b w:val="0"/>
-                <w:sz w:val="16"/>
+                <w:sz w:val="17"/>
               </w:rPr>
-              <w:t>FY2025</w:t>
+              <w:t>1 February 2025 to 28 February 2025</w:t>
             </w:r>
           </w:p>
         </w:tc>
         <w:tc>
           <w:tcPr>
-            <w:tcW w:type="dxa" w:w="2154"/>
+            <w:tcW w:type="dxa" w:w="2493"/>
           </w:tcPr>
           <w:p>
             <w:pPr>
-              <w:spacing w:after="0"/>
+              <w:spacing w:after="20" w:before="20"/>
               <w:jc w:val="center"/>
             </w:pPr>
+            <w:r/>
             <w:r>
               <w:rPr>
+                <w:rFonts w:ascii="Calibri" w:hAnsi="Calibri"/>
                 <w:b w:val="0"/>
-                <w:sz w:val="16"/>
-              </w:rPr>
-              <w:t>1 Jan 2025 - 31 Dec 2025</w:t>
-            </w:r>
-          </w:p>
-        </w:tc>
-        <w:tc>
-          <w:tcPr>
-            <w:tcW w:type="dxa" w:w="1361"/>
-          </w:tcPr>
-          <w:p>
-            <w:pPr>
-              <w:spacing w:after="0"/>
-              <w:jc w:val="center"/>
-            </w:pPr>
-            <w:r>
-              <w:rPr>
-                <w:b/>
-                <w:sz w:val="16"/>
+                <w:sz w:val="17"/>
               </w:rPr>
               <w:t>NIL (0.00)</w:t>
             </w:r>
@@ -642,17 +420,19 @@
         </w:tc>
         <w:tc>
           <w:tcPr>
-            <w:tcW w:type="dxa" w:w="1361"/>
+            <w:tcW w:type="dxa" w:w="2493"/>
           </w:tcPr>
           <w:p>
             <w:pPr>
-              <w:spacing w:after="0"/>
+              <w:spacing w:after="20" w:before="20"/>
               <w:jc w:val="center"/>
             </w:pPr>
+            <w:r/>
             <w:r>
               <w:rPr>
-                <w:b/>
-                <w:sz w:val="16"/>
+                <w:rFonts w:ascii="Calibri" w:hAnsi="Calibri"/>
+                <w:b w:val="0"/>
+                <w:sz w:val="17"/>
               </w:rPr>
               <w:t>NIL (0.00)</w:t>
             </w:r>
@@ -660,35 +440,19 @@
         </w:tc>
         <w:tc>
           <w:tcPr>
-            <w:tcW w:type="dxa" w:w="1417"/>
+            <w:tcW w:type="dxa" w:w="2493"/>
           </w:tcPr>
           <w:p>
             <w:pPr>
-              <w:spacing w:after="0"/>
+              <w:spacing w:after="20" w:before="20"/>
               <w:jc w:val="center"/>
             </w:pPr>
+            <w:r/>
             <w:r>
               <w:rPr>
-                <w:b/>
-                <w:sz w:val="16"/>
-              </w:rPr>
-              <w:t>NIL (0.00)</w:t>
-            </w:r>
-          </w:p>
-        </w:tc>
-        <w:tc>
-          <w:tcPr>
-            <w:tcW w:type="dxa" w:w="1417"/>
-          </w:tcPr>
-          <w:p>
-            <w:pPr>
-              <w:spacing w:after="0"/>
-              <w:jc w:val="center"/>
-            </w:pPr>
-            <w:r>
-              <w:rPr>
-                <w:b/>
-                <w:sz w:val="16"/>
+                <w:rFonts w:ascii="Calibri" w:hAnsi="Calibri"/>
+                <w:b w:val="0"/>
+                <w:sz w:val="17"/>
               </w:rPr>
               <w:t>NIL (0.00)</w:t>
             </w:r>
@@ -698,226 +462,394 @@
     </w:tbl>
     <w:p>
       <w:pPr>
-        <w:spacing w:after="40" w:before="0" w:line="228" w:lineRule="auto"/>
+        <w:spacing w:after="40" w:before="0" w:line="240" w:lineRule="auto"/>
       </w:pPr>
       <w:r>
         <w:rPr>
           <w:rFonts w:ascii="Calibri" w:hAnsi="Calibri"/>
           <w:b w:val="0"/>
           <w:i w:val="0"/>
-          <w:sz w:val="20"/>
+          <w:sz w:val="8"/>
         </w:rPr>
       </w:r>
     </w:p>
     <w:p>
       <w:pPr>
-        <w:spacing w:after="40" w:before="0" w:line="228" w:lineRule="auto"/>
+        <w:spacing w:after="160" w:before="0" w:line="240" w:lineRule="auto"/>
+        <w:jc w:val="both"/>
+      </w:pPr>
+      <w:r>
+        <w:rPr>
+          <w:rFonts w:ascii="Calibri" w:hAnsi="Calibri"/>
+          <w:b w:val="0"/>
+          <w:i w:val="0"/>
+          <w:sz w:val="19"/>
+        </w:rPr>
+        <w:t>The Company earned NIL revenue and held NIL assets throughout its entire existence. It never commenced commercial operations. The only charges recorded were administration expenses of AED 6,260.00, consisting solely of legal and professional fees, which were borne by the shareholder in his personal capacity and are reflected in the shareholder's current account. As at the date of liquidation the Company had no assets and no liabilities.</w:t>
+      </w:r>
+    </w:p>
+    <w:p>
+      <w:pPr>
+        <w:spacing w:after="60" w:before="0" w:line="240" w:lineRule="auto"/>
       </w:pPr>
       <w:r>
         <w:rPr>
           <w:rFonts w:ascii="Calibri" w:hAnsi="Calibri"/>
           <w:b/>
           <w:i w:val="0"/>
-          <w:sz w:val="18"/>
+          <w:sz w:val="19"/>
         </w:rPr>
-        <w:t>2.  STATEMENT OF FACTS</w:t>
+        <w:t>4.  Supporting Facts</w:t>
       </w:r>
     </w:p>
     <w:p>
       <w:pPr>
-        <w:spacing w:after="20" w:line="228" w:lineRule="auto"/>
-        <w:ind w:left="482" w:hanging="482"/>
+        <w:pStyle w:val="ListBullet"/>
+        <w:spacing w:after="40" w:before="0" w:line="240" w:lineRule="auto"/>
+        <w:ind w:left="397"/>
       </w:pPr>
       <w:r>
         <w:rPr>
-          <w:b/>
+          <w:rFonts w:ascii="Calibri" w:hAnsi="Calibri"/>
           <w:sz w:val="18"/>
         </w:rPr>
-        <w:t xml:space="preserve">2.1  </w:t>
-      </w:r>
-      <w:r>
-        <w:rPr>
-          <w:sz w:val="18"/>
-        </w:rPr>
-        <w:t>The Taxable Person was incorporated on &lt;&lt;DD Month YYYY&gt;&gt; under trade licence no. 41532 issued by DIEZ - Dubai Silicon Oasis, and is not registered for Value Added Tax.</w:t>
+        <w:t>The Company never traded and generated no revenue in any Tax Period.</w:t>
       </w:r>
     </w:p>
     <w:p>
       <w:pPr>
-        <w:spacing w:after="20" w:line="228" w:lineRule="auto"/>
-        <w:ind w:left="482" w:hanging="482"/>
+        <w:pStyle w:val="ListBullet"/>
+        <w:spacing w:after="40" w:before="0" w:line="240" w:lineRule="auto"/>
+        <w:ind w:left="397"/>
       </w:pPr>
       <w:r>
         <w:rPr>
-          <w:b/>
+          <w:rFonts w:ascii="Calibri" w:hAnsi="Calibri"/>
           <w:sz w:val="18"/>
         </w:rPr>
-        <w:t xml:space="preserve">2.2  </w:t>
-      </w:r>
-      <w:r>
-        <w:rPr>
-          <w:sz w:val="18"/>
-        </w:rPr>
-        <w:t>It never commenced trading. At no point during its existence did it carry on any commercial, industrial or professional activity, whether within or outside the United Arab Emirates.</w:t>
+        <w:t>The Company held no fixed assets, no inventory and no receivables at any time.</w:t>
       </w:r>
     </w:p>
     <w:p>
       <w:pPr>
-        <w:spacing w:after="20" w:line="228" w:lineRule="auto"/>
-        <w:ind w:left="482" w:hanging="482"/>
+        <w:pStyle w:val="ListBullet"/>
+        <w:spacing w:after="40" w:before="0" w:line="240" w:lineRule="auto"/>
+        <w:ind w:left="397"/>
       </w:pPr>
       <w:r>
         <w:rPr>
-          <w:b/>
+          <w:rFonts w:ascii="Calibri" w:hAnsi="Calibri"/>
           <w:sz w:val="18"/>
         </w:rPr>
-        <w:t xml:space="preserve">2.3  </w:t>
-      </w:r>
-      <w:r>
-        <w:rPr>
-          <w:sz w:val="18"/>
-        </w:rPr>
-        <w:t>It generated no revenue and derived no income of any nature in any tax period; revenue was AED 0.00 throughout. No taxable income arose and no Corporate Tax is payable for any tax period.</w:t>
+        <w:t>The two bank accounts held with Wio Bank P.J.S.C (9485724553, AED, and 9451723126, EUR) were closed on 29 January 2025 and carried no balance at closure.</w:t>
       </w:r>
     </w:p>
     <w:p>
       <w:pPr>
-        <w:spacing w:after="20" w:line="228" w:lineRule="auto"/>
-        <w:ind w:left="482" w:hanging="482"/>
+        <w:pStyle w:val="ListBullet"/>
+        <w:spacing w:after="40" w:before="0" w:line="240" w:lineRule="auto"/>
+        <w:ind w:left="397"/>
       </w:pPr>
       <w:r>
         <w:rPr>
-          <w:b/>
+          <w:rFonts w:ascii="Calibri" w:hAnsi="Calibri"/>
           <w:sz w:val="18"/>
         </w:rPr>
-        <w:t xml:space="preserve">2.4  </w:t>
-      </w:r>
-      <w:r>
-        <w:rPr>
-          <w:sz w:val="18"/>
-        </w:rPr>
-        <w:t>It held no assets and owed no liabilities at any time; total assets and total liabilities were AED 0.00 at the beginning and at the end of each tax period.</w:t>
+        <w:t>All employee dues were settled and no claims remain from any employee.</w:t>
       </w:r>
     </w:p>
     <w:p>
       <w:pPr>
-        <w:spacing w:after="20" w:line="228" w:lineRule="auto"/>
-        <w:ind w:left="482" w:hanging="482"/>
+        <w:pStyle w:val="ListBullet"/>
+        <w:spacing w:after="40" w:before="0" w:line="240" w:lineRule="auto"/>
+        <w:ind w:left="397"/>
       </w:pPr>
       <w:r>
         <w:rPr>
-          <w:b/>
+          <w:rFonts w:ascii="Calibri" w:hAnsi="Calibri"/>
           <w:sz w:val="18"/>
         </w:rPr>
-        <w:t xml:space="preserve">2.5  </w:t>
-      </w:r>
-      <w:r>
-        <w:rPr>
-          <w:sz w:val="18"/>
-        </w:rPr>
-        <w:t>In addition: no bank account was opened or operated in its name and no funds were received or disbursed by it; it employed no staff and no residence visa was issued under its establishment card; it owned no fixed assets, inventory, intangible assets or investments at any time; such incorporation and licence fees as were incurred were borne personally by the shareholder and were never recorded as expenses, liabilities or capital contributions of the Taxable Person.</w:t>
+        <w:t>All creditors were settled and no claims were received from any creditor.</w:t>
       </w:r>
     </w:p>
     <w:p>
       <w:pPr>
-        <w:spacing w:after="40" w:before="0" w:line="228" w:lineRule="auto"/>
+        <w:pStyle w:val="ListBullet"/>
+        <w:spacing w:after="40" w:before="0" w:line="240" w:lineRule="auto"/>
+        <w:ind w:left="397"/>
+      </w:pPr>
+      <w:r>
+        <w:rPr>
+          <w:rFonts w:ascii="Calibri" w:hAnsi="Calibri"/>
+          <w:sz w:val="18"/>
+        </w:rPr>
+        <w:t>The issued share capital of AED 10,000.00 was fully accounted for; total equity at the close of liquidation was NIL.</w:t>
+      </w:r>
+    </w:p>
+    <w:p>
+      <w:pPr>
+        <w:pStyle w:val="ListBullet"/>
+        <w:spacing w:after="40" w:before="0" w:line="240" w:lineRule="auto"/>
+        <w:ind w:left="397"/>
+      </w:pPr>
+      <w:r>
+        <w:rPr>
+          <w:rFonts w:ascii="Calibri" w:hAnsi="Calibri"/>
+          <w:sz w:val="18"/>
+        </w:rPr>
+        <w:t>The liquidation was carried out by Axis Auditing &amp; Accounting L.L.C (Walid Aqil Mohammed Abdulla AlRafi, Registration No. 1104, Dubai, U.A.E), whose Liquidator's Report dated 6 February 2025 confirms that the liquidation proceedings are closed.</w:t>
+      </w:r>
+    </w:p>
+    <w:p>
+      <w:pPr>
+        <w:pStyle w:val="ListBullet"/>
+        <w:spacing w:after="40" w:before="0" w:line="240" w:lineRule="auto"/>
+        <w:ind w:left="397"/>
+      </w:pPr>
+      <w:r>
+        <w:rPr>
+          <w:rFonts w:ascii="Calibri" w:hAnsi="Calibri"/>
+          <w:sz w:val="18"/>
+        </w:rPr>
+        <w:t>The trade licence was officially cancelled by Dubai Integrated Economic Zones Authority (DIEZ) - Dubai Silicon Oasis on 28 February 2025; the cancellation notice may be verified at https://verify.diez.ae/yFkkaN.</w:t>
+      </w:r>
+    </w:p>
+    <w:p>
+      <w:pPr>
+        <w:pStyle w:val="ListBullet"/>
+        <w:spacing w:after="40" w:before="0" w:line="240" w:lineRule="auto"/>
+        <w:ind w:left="397"/>
+      </w:pPr>
+      <w:r>
+        <w:rPr>
+          <w:rFonts w:ascii="Calibri" w:hAnsi="Calibri"/>
+          <w:sz w:val="18"/>
+        </w:rPr>
+        <w:t>Between 1 February 2025 and 28 February 2025 the Company was already in liquidation, held no assets, operated no bank account and carried out no activity whatsoever.</w:t>
+      </w:r>
+    </w:p>
+    <w:p>
+      <w:pPr>
+        <w:spacing w:after="40" w:before="0" w:line="240" w:lineRule="auto"/>
       </w:pPr>
       <w:r>
         <w:rPr>
           <w:rFonts w:ascii="Calibri" w:hAnsi="Calibri"/>
           <w:b w:val="0"/>
           <w:i w:val="0"/>
-          <w:sz w:val="20"/>
+          <w:sz w:val="8"/>
         </w:rPr>
       </w:r>
     </w:p>
     <w:p>
       <w:pPr>
-        <w:spacing w:after="40" w:before="0" w:line="228" w:lineRule="auto"/>
+        <w:spacing w:after="60" w:before="0" w:line="240" w:lineRule="auto"/>
       </w:pPr>
       <w:r>
         <w:rPr>
           <w:rFonts w:ascii="Calibri" w:hAnsi="Calibri"/>
           <w:b/>
           <w:i w:val="0"/>
-          <w:sz w:val="18"/>
+          <w:sz w:val="19"/>
         </w:rPr>
-        <w:t>3.  REASON FOR DE-REGISTRATION (in response to the Authority's query of 30 April 2025)</w:t>
+        <w:t>5.  Documents Enclosed</w:t>
       </w:r>
     </w:p>
     <w:p>
       <w:pPr>
-        <w:spacing w:after="80" w:before="0" w:line="228" w:lineRule="auto"/>
+        <w:spacing w:after="40" w:before="0" w:line="240" w:lineRule="auto"/>
+        <w:ind w:left="397"/>
+      </w:pPr>
+      <w:r>
+        <w:rPr>
+          <w:rFonts w:ascii="Calibri" w:hAnsi="Calibri"/>
+          <w:sz w:val="18"/>
+        </w:rPr>
+        <w:t>(1)  Notice of Termination / Cancellation of Company issued by Dubai Silicon Oasis dated 28 February 2025 (official cancellation of the trade licence).</w:t>
+      </w:r>
+    </w:p>
+    <w:p>
+      <w:pPr>
+        <w:spacing w:after="40" w:before="0" w:line="240" w:lineRule="auto"/>
+        <w:ind w:left="397"/>
+      </w:pPr>
+      <w:r>
+        <w:rPr>
+          <w:rFonts w:ascii="Calibri" w:hAnsi="Calibri"/>
+          <w:sz w:val="18"/>
+        </w:rPr>
+        <w:t>(2)  Liquidator's Report and audited Financial Statements for the period from 13 February 2024 to 31 January 2025, comprising the Statement of Financial Position, the Statement of Comprehensive Income, the Statement of Changes in Equity, the Statement of Cash Flows and the Notes, signed and stamped.</w:t>
+      </w:r>
+    </w:p>
+    <w:p>
+      <w:pPr>
+        <w:spacing w:after="40" w:before="0" w:line="240" w:lineRule="auto"/>
+        <w:ind w:left="397"/>
+      </w:pPr>
+      <w:r>
+        <w:rPr>
+          <w:rFonts w:ascii="Calibri" w:hAnsi="Calibri"/>
+          <w:sz w:val="18"/>
+        </w:rPr>
+        <w:t>(3)  Trial Balance as at 31 January 2025, signed and stamped.</w:t>
+      </w:r>
+    </w:p>
+    <w:p>
+      <w:pPr>
+        <w:spacing w:after="40" w:before="0" w:line="240" w:lineRule="auto"/>
+        <w:ind w:left="397"/>
+      </w:pPr>
+      <w:r>
+        <w:rPr>
+          <w:rFonts w:ascii="Calibri" w:hAnsi="Calibri"/>
+          <w:sz w:val="18"/>
+        </w:rPr>
+        <w:t>(4)  Trade Licence No. 41532 issued by Dubai Integrated Economic Zones Authority (DIEZ) - Dubai Silicon Oasis.</w:t>
+      </w:r>
+    </w:p>
+    <w:p>
+      <w:pPr>
+        <w:spacing w:after="40" w:before="0" w:line="240" w:lineRule="auto"/>
+        <w:ind w:left="397"/>
+      </w:pPr>
+      <w:r>
+        <w:rPr>
+          <w:rFonts w:ascii="Calibri" w:hAnsi="Calibri"/>
+          <w:sz w:val="18"/>
+        </w:rPr>
+        <w:t>(5)  This Declaration Letter, signed and stamped.</w:t>
+      </w:r>
+    </w:p>
+    <w:p>
+      <w:pPr>
+        <w:spacing w:after="80" w:before="0" w:line="240" w:lineRule="auto"/>
       </w:pPr>
       <w:r>
         <w:rPr>
           <w:rFonts w:ascii="Calibri" w:hAnsi="Calibri"/>
           <w:b w:val="0"/>
           <w:i w:val="0"/>
-          <w:sz w:val="18"/>
+          <w:sz w:val="8"/>
         </w:rPr>
-        <w:t>De-registration is applied for on the ground of cessation of business and business activity. The Taxable Person ceased all business and business activity on &lt;&lt;DD Month YYYY&gt;&gt; and its trade licence no. 41532 expired on &lt;&lt;DD Month YYYY&gt;&gt; and has not been renewed at any time since. It has no intention of resuming any activity and exists only as a dormant registration record. The application is made pursuant to Article 52 of Federal Decree-Law No. 47 of 2022 on the Taxation of Corporations and Businesses.</w:t>
       </w:r>
     </w:p>
     <w:p>
       <w:pPr>
-        <w:spacing w:after="80" w:before="0" w:line="228" w:lineRule="auto"/>
+        <w:spacing w:after="60" w:before="0" w:line="240" w:lineRule="auto"/>
+      </w:pPr>
+      <w:r>
+        <w:rPr>
+          <w:rFonts w:ascii="Calibri" w:hAnsi="Calibri"/>
+          <w:b/>
+          <w:i w:val="0"/>
+          <w:sz w:val="19"/>
+        </w:rPr>
+        <w:t>6.  Request</w:t>
+      </w:r>
+    </w:p>
+    <w:p>
+      <w:pPr>
+        <w:spacing w:after="120" w:before="0" w:line="240" w:lineRule="auto"/>
+        <w:jc w:val="both"/>
       </w:pPr>
       <w:r>
         <w:rPr>
           <w:rFonts w:ascii="Calibri" w:hAnsi="Calibri"/>
           <w:b w:val="0"/>
           <w:i w:val="0"/>
-          <w:sz w:val="18"/>
+          <w:sz w:val="19"/>
         </w:rPr>
-        <w:t>4.  DECLARATION AND UNDERTAKING.  I, the undersigned, being the authorised signatory of the Taxable Person, declare that the information in this letter is true, complete and accurate in all respects and covers every tax period of the Taxable Person without exception. I undertake to provide any further document or clarification the Authority may require.</w:t>
+        <w:t>The Company has ceased its business, has been liquidated and its trade licence has been officially cancelled. We therefore respectfully request the Authority to approve the de-registration of the Company from Corporate Tax pursuant to Article 52 of Federal Decree-Law No. 47 of 2022.</w:t>
       </w:r>
     </w:p>
     <w:p>
       <w:pPr>
-        <w:spacing w:after="200" w:before="0" w:line="228" w:lineRule="auto"/>
+        <w:spacing w:after="200" w:before="0" w:line="240" w:lineRule="auto"/>
+        <w:jc w:val="both"/>
       </w:pPr>
       <w:r>
         <w:rPr>
           <w:rFonts w:ascii="Calibri" w:hAnsi="Calibri"/>
           <w:b w:val="0"/>
           <w:i w:val="0"/>
-          <w:sz w:val="18"/>
+          <w:sz w:val="19"/>
+        </w:rPr>
+        <w:t>I confirm that the information given in this letter is true, correct and complete, and that it is consistent in all respects with the audited financial statements enclosed.</w:t>
+      </w:r>
+    </w:p>
+    <w:p>
+      <w:pPr>
+        <w:spacing w:after="520" w:before="0" w:line="240" w:lineRule="auto"/>
+      </w:pPr>
+      <w:r>
+        <w:rPr>
+          <w:rFonts w:ascii="Calibri" w:hAnsi="Calibri"/>
+          <w:b w:val="0"/>
+          <w:i w:val="0"/>
+          <w:sz w:val="19"/>
         </w:rPr>
         <w:t>Yours faithfully,</w:t>
       </w:r>
     </w:p>
     <w:p>
       <w:pPr>
-        <w:spacing w:after="20" w:before="0" w:line="228" w:lineRule="auto"/>
+        <w:spacing w:after="40" w:before="0" w:line="240" w:lineRule="auto"/>
       </w:pPr>
       <w:r>
         <w:rPr>
           <w:rFonts w:ascii="Calibri" w:hAnsi="Calibri"/>
           <w:b w:val="0"/>
           <w:i w:val="0"/>
-          <w:sz w:val="18"/>
+          <w:sz w:val="19"/>
         </w:rPr>
         <w:t>_______________________________</w:t>
       </w:r>
     </w:p>
     <w:p>
       <w:pPr>
-        <w:spacing w:after="20" w:before="0" w:line="228" w:lineRule="auto"/>
+        <w:spacing w:after="0" w:before="0" w:line="240" w:lineRule="auto"/>
       </w:pPr>
       <w:r>
         <w:rPr>
           <w:rFonts w:ascii="Calibri" w:hAnsi="Calibri"/>
           <w:b/>
           <w:i w:val="0"/>
-          <w:sz w:val="18"/>
+          <w:sz w:val="19"/>
         </w:rPr>
-        <w:t>&lt;&lt;NOM COMPLET&gt;&gt;</w:t>
+        <w:t>Elies Bechahed</w:t>
       </w:r>
     </w:p>
     <w:p>
       <w:pPr>
-        <w:spacing w:after="20" w:before="0" w:line="228" w:lineRule="auto"/>
+        <w:spacing w:after="0" w:before="0" w:line="240" w:lineRule="auto"/>
+      </w:pPr>
+      <w:r>
+        <w:rPr>
+          <w:rFonts w:ascii="Calibri" w:hAnsi="Calibri"/>
+          <w:b w:val="0"/>
+          <w:i w:val="0"/>
+          <w:sz w:val="19"/>
+        </w:rPr>
+        <w:t>Shareholder and Manager</w:t>
+      </w:r>
+    </w:p>
+    <w:p>
+      <w:pPr>
+        <w:spacing w:after="0" w:before="0" w:line="240" w:lineRule="auto"/>
+      </w:pPr>
+      <w:r>
+        <w:rPr>
+          <w:rFonts w:ascii="Calibri" w:hAnsi="Calibri"/>
+          <w:b w:val="0"/>
+          <w:i w:val="0"/>
+          <w:sz w:val="19"/>
+        </w:rPr>
+        <w:t>ELIES ECOMMERCE &amp; DIGITAL - FZCO</w:t>
+      </w:r>
+    </w:p>
+    <w:p>
+      <w:pPr>
+        <w:spacing w:after="120" w:before="0" w:line="240" w:lineRule="auto"/>
       </w:pPr>
       <w:r>
         <w:rPr>
@@ -926,26 +858,12 @@
           <w:i w:val="0"/>
           <w:sz w:val="17"/>
         </w:rPr>
-        <w:t>Manager / Authorised Signatory, ELIES ECOMMERCE &amp; DIGITAL FZCO</w:t>
+        <w:t>Email: elies.bechahed@gmail.com  |  Mobile: +971 58 528 1013</w:t>
       </w:r>
     </w:p>
     <w:p>
       <w:pPr>
-        <w:spacing w:after="60" w:before="0" w:line="228" w:lineRule="auto"/>
-      </w:pPr>
-      <w:r>
-        <w:rPr>
-          <w:rFonts w:ascii="Calibri" w:hAnsi="Calibri"/>
-          <w:b w:val="0"/>
-          <w:i w:val="0"/>
-          <w:sz w:val="17"/>
-        </w:rPr>
-        <w:t>Emirates ID / Passport No.: &lt;&lt;NUMERO&gt;&gt;   |   Email: elies.bechahed@gmail.com   |   Mobile: &lt;&lt;+971 ...&gt;&gt;</w:t>
-      </w:r>
-    </w:p>
-    <w:p>
-      <w:pPr>
-        <w:spacing w:after="20" w:before="0" w:line="228" w:lineRule="auto"/>
+        <w:spacing w:after="0" w:before="0" w:line="240" w:lineRule="auto"/>
       </w:pPr>
       <w:r>
         <w:rPr>
@@ -954,12 +872,12 @@
           <w:i/>
           <w:sz w:val="17"/>
         </w:rPr>
-        <w:t>[ COMPANY STAMP ]</w:t>
+        <w:t>(Company stamp)</w:t>
       </w:r>
     </w:p>
     <w:sectPr>
       <w:pgSz w:w="12240" w:h="15840"/>
-      <w:pgMar w:top="567" w:right="1077" w:bottom="510" w:left="1077" w:header="720" w:footer="720" w:gutter="0"/>
+      <w:pgMar w:top="680" w:right="1134" w:bottom="567" w:left="1134" w:header="720" w:footer="720" w:gutter="0"/>
       <w:cols w:space="720"/>
       <w:docGrid w:linePitch="360"/>
     </w:sectPr>
@@ -1332,7 +1250,7 @@
     <w:rsid w:val="00FC693F"/>
     <w:rPr>
       <w:rFonts w:ascii="Calibri" w:hAnsi="Calibri"/>
-      <w:sz w:val="18"/>
+      <w:sz w:val="19"/>
     </w:rPr>
   </w:style>
   <w:style w:type="paragraph" w:styleId="Header">

</xml_diff>